<commit_message>
update the code and docs
</commit_message>
<xml_diff>
--- a/hw5.docx
+++ b/hw5.docx
@@ -27,7 +27,13 @@
       </w:r>
       <w:r>
         <w:br/>
-        <w:t>Name: __________________________ </w:t>
+        <w:t>Name: _____</w:t>
+      </w:r>
+      <w:r>
+        <w:t>Max L</w:t>
+      </w:r>
+      <w:r>
+        <w:t>________ </w:t>
       </w:r>
       <w:r>
         <w:br/>
@@ -178,11 +184,15 @@
           </m:rPr>
           <w:rPr>
             <w:rFonts w:ascii="Cambria Math" w:hAnsi="Cambria Math"/>
+            <w:highlight w:val="yellow"/>
           </w:rPr>
           <m:t>▫</m:t>
         </m:r>
       </m:oMath>
       <w:r>
+        <w:rPr>
+          <w:highlight w:val="yellow"/>
+        </w:rPr>
         <w:t xml:space="preserve"> A decoder model</w:t>
       </w:r>
       <w:r>
@@ -209,11 +219,15 @@
           </m:rPr>
           <w:rPr>
             <w:rFonts w:ascii="Cambria Math" w:hAnsi="Cambria Math"/>
+            <w:highlight w:val="yellow"/>
           </w:rPr>
           <m:t>▫</m:t>
         </m:r>
       </m:oMath>
       <w:r>
+        <w:rPr>
+          <w:highlight w:val="yellow"/>
+        </w:rPr>
         <w:t xml:space="preserve"> An encoder model</w:t>
       </w:r>
       <w:r>
@@ -274,14 +288,21 @@
           </m:rPr>
           <w:rPr>
             <w:rFonts w:ascii="Cambria Math" w:hAnsi="Cambria Math"/>
+            <w:highlight w:val="yellow"/>
           </w:rPr>
           <m:t>▫</m:t>
         </m:r>
       </m:oMath>
       <w:r>
+        <w:rPr>
+          <w:highlight w:val="yellow"/>
+        </w:rPr>
         <w:t xml:space="preserve"> Sentiment classification (input a piece of text and output a 0/1 to denote positive or negative sentiment)</w:t>
       </w:r>
       <w:r>
+        <w:rPr>
+          <w:highlight w:val="yellow"/>
+        </w:rPr>
         <w:br/>
       </w:r>
       <m:oMath>
@@ -291,11 +312,15 @@
           </m:rPr>
           <w:rPr>
             <w:rFonts w:ascii="Cambria Math" w:hAnsi="Cambria Math"/>
+            <w:highlight w:val="yellow"/>
           </w:rPr>
           <m:t>▫</m:t>
         </m:r>
       </m:oMath>
       <w:r>
+        <w:rPr>
+          <w:highlight w:val="yellow"/>
+        </w:rPr>
         <w:t xml:space="preserve"> Gender recognition from speech (input an audio clip and output a label indicating the speaker’s gender)</w:t>
       </w:r>
       <w:r>
@@ -310,7 +335,15 @@
         </w:numPr>
       </w:pPr>
       <w:r>
-        <w:t>What possible source can the bias observed in a model have?</w:t>
+        <w:t xml:space="preserve">What possible source can the bias </w:t>
+      </w:r>
+      <w:proofErr w:type="gramStart"/>
+      <w:r>
+        <w:t>observed</w:t>
+      </w:r>
+      <w:proofErr w:type="gramEnd"/>
+      <w:r>
+        <w:t xml:space="preserve"> in a model have?</w:t>
       </w:r>
       <w:r>
         <w:br/>
@@ -322,14 +355,35 @@
           </m:rPr>
           <w:rPr>
             <w:rFonts w:ascii="Cambria Math" w:hAnsi="Cambria Math"/>
+            <w:highlight w:val="yellow"/>
           </w:rPr>
           <m:t>▫</m:t>
         </m:r>
       </m:oMath>
       <w:r>
-        <w:t xml:space="preserve"> The model is a fine-tuned version of a pretrained model and it picked up its bias from it.</w:t>
-      </w:r>
-      <w:r>
+        <w:rPr>
+          <w:highlight w:val="yellow"/>
+        </w:rPr>
+        <w:t xml:space="preserve"> The model is a fine-tuned version of a pretrained </w:t>
+      </w:r>
+      <w:proofErr w:type="gramStart"/>
+      <w:r>
+        <w:rPr>
+          <w:highlight w:val="yellow"/>
+        </w:rPr>
+        <w:t>model</w:t>
+      </w:r>
+      <w:proofErr w:type="gramEnd"/>
+      <w:r>
+        <w:rPr>
+          <w:highlight w:val="yellow"/>
+        </w:rPr>
+        <w:t xml:space="preserve"> and it picked up its bias from it.</w:t>
+      </w:r>
+      <w:r>
+        <w:rPr>
+          <w:highlight w:val="yellow"/>
+        </w:rPr>
         <w:br/>
       </w:r>
       <m:oMath>
@@ -339,14 +393,21 @@
           </m:rPr>
           <w:rPr>
             <w:rFonts w:ascii="Cambria Math" w:hAnsi="Cambria Math"/>
+            <w:highlight w:val="yellow"/>
           </w:rPr>
           <m:t>▫</m:t>
         </m:r>
       </m:oMath>
       <w:r>
+        <w:rPr>
+          <w:highlight w:val="yellow"/>
+        </w:rPr>
         <w:t xml:space="preserve"> The data the model was trained on is biased.</w:t>
       </w:r>
       <w:r>
+        <w:rPr>
+          <w:highlight w:val="yellow"/>
+        </w:rPr>
         <w:br/>
       </w:r>
       <m:oMath>
@@ -356,11 +417,15 @@
           </m:rPr>
           <w:rPr>
             <w:rFonts w:ascii="Cambria Math" w:hAnsi="Cambria Math"/>
+            <w:highlight w:val="yellow"/>
           </w:rPr>
           <m:t>▫</m:t>
         </m:r>
       </m:oMath>
       <w:r>
+        <w:rPr>
+          <w:highlight w:val="yellow"/>
+        </w:rPr>
         <w:t xml:space="preserve"> The metric the model was optimizing for is biased.</w:t>
       </w:r>
       <w:r>
@@ -421,11 +486,15 @@
           </m:rPr>
           <w:rPr>
             <w:rFonts w:ascii="Cambria Math" w:hAnsi="Cambria Math"/>
+            <w:highlight w:val="yellow"/>
           </w:rPr>
           <m:t>▫</m:t>
         </m:r>
       </m:oMath>
       <w:r>
+        <w:rPr>
+          <w:highlight w:val="yellow"/>
+        </w:rPr>
         <w:t xml:space="preserve"> 3: The sequence length, the batch size, and the hidden size</w:t>
       </w:r>
       <w:r>
@@ -640,11 +709,15 @@
           </m:rPr>
           <w:rPr>
             <w:rFonts w:ascii="Cambria Math" w:hAnsi="Cambria Math"/>
+            <w:highlight w:val="yellow"/>
           </w:rPr>
           <m:t>▫</m:t>
         </m:r>
       </m:oMath>
       <w:r>
+        <w:rPr>
+          <w:highlight w:val="yellow"/>
+        </w:rPr>
         <w:t xml:space="preserve"> Estimating P(</w:t>
       </w:r>
       <m:oMath>
@@ -653,6 +726,7 @@
             <m:ctrlPr>
               <w:rPr>
                 <w:rFonts w:ascii="Cambria Math" w:hAnsi="Cambria Math"/>
+                <w:highlight w:val="yellow"/>
               </w:rPr>
             </m:ctrlPr>
           </m:sSubPr>
@@ -660,6 +734,7 @@
             <m:r>
               <w:rPr>
                 <w:rFonts w:ascii="Cambria Math" w:hAnsi="Cambria Math"/>
+                <w:highlight w:val="yellow"/>
               </w:rPr>
               <m:t>y</m:t>
             </m:r>
@@ -668,6 +743,7 @@
             <m:r>
               <w:rPr>
                 <w:rFonts w:ascii="Cambria Math" w:hAnsi="Cambria Math"/>
+                <w:highlight w:val="yellow"/>
               </w:rPr>
               <m:t>t</m:t>
             </m:r>
@@ -679,6 +755,7 @@
           </m:rPr>
           <w:rPr>
             <w:rFonts w:ascii="Cambria Math" w:hAnsi="Cambria Math"/>
+            <w:highlight w:val="yellow"/>
           </w:rPr>
           <m:t>|</m:t>
         </m:r>
@@ -687,6 +764,7 @@
             <m:ctrlPr>
               <w:rPr>
                 <w:rFonts w:ascii="Cambria Math" w:hAnsi="Cambria Math"/>
+                <w:highlight w:val="yellow"/>
               </w:rPr>
             </m:ctrlPr>
           </m:sSubPr>
@@ -694,6 +772,7 @@
             <m:r>
               <w:rPr>
                 <w:rFonts w:ascii="Cambria Math" w:hAnsi="Cambria Math"/>
+                <w:highlight w:val="yellow"/>
               </w:rPr>
               <m:t>y</m:t>
             </m:r>
@@ -702,6 +781,7 @@
             <m:r>
               <w:rPr>
                 <w:rFonts w:ascii="Cambria Math" w:hAnsi="Cambria Math"/>
+                <w:highlight w:val="yellow"/>
               </w:rPr>
               <m:t>1</m:t>
             </m:r>
@@ -713,6 +793,7 @@
           </m:rPr>
           <w:rPr>
             <w:rFonts w:ascii="Cambria Math" w:hAnsi="Cambria Math"/>
+            <w:highlight w:val="yellow"/>
           </w:rPr>
           <m:t>,</m:t>
         </m:r>
@@ -721,6 +802,7 @@
             <m:ctrlPr>
               <w:rPr>
                 <w:rFonts w:ascii="Cambria Math" w:hAnsi="Cambria Math"/>
+                <w:highlight w:val="yellow"/>
               </w:rPr>
             </m:ctrlPr>
           </m:sSubPr>
@@ -728,6 +810,7 @@
             <m:r>
               <w:rPr>
                 <w:rFonts w:ascii="Cambria Math" w:hAnsi="Cambria Math"/>
+                <w:highlight w:val="yellow"/>
               </w:rPr>
               <m:t>y</m:t>
             </m:r>
@@ -736,6 +819,7 @@
             <m:r>
               <w:rPr>
                 <w:rFonts w:ascii="Cambria Math" w:hAnsi="Cambria Math"/>
+                <w:highlight w:val="yellow"/>
               </w:rPr>
               <m:t>2</m:t>
             </m:r>
@@ -747,6 +831,7 @@
           </m:rPr>
           <w:rPr>
             <w:rFonts w:ascii="Cambria Math" w:hAnsi="Cambria Math"/>
+            <w:highlight w:val="yellow"/>
           </w:rPr>
           <m:t>,...,</m:t>
         </m:r>
@@ -755,6 +840,7 @@
             <m:ctrlPr>
               <w:rPr>
                 <w:rFonts w:ascii="Cambria Math" w:hAnsi="Cambria Math"/>
+                <w:highlight w:val="yellow"/>
               </w:rPr>
             </m:ctrlPr>
           </m:sSubPr>
@@ -762,6 +848,7 @@
             <m:r>
               <w:rPr>
                 <w:rFonts w:ascii="Cambria Math" w:hAnsi="Cambria Math"/>
+                <w:highlight w:val="yellow"/>
               </w:rPr>
               <m:t>y</m:t>
             </m:r>
@@ -770,6 +857,7 @@
             <m:r>
               <w:rPr>
                 <w:rFonts w:ascii="Cambria Math" w:hAnsi="Cambria Math"/>
+                <w:highlight w:val="yellow"/>
               </w:rPr>
               <m:t>t</m:t>
             </m:r>
@@ -779,12 +867,14 @@
               </m:rPr>
               <w:rPr>
                 <w:rFonts w:ascii="Cambria Math" w:hAnsi="Cambria Math"/>
+                <w:highlight w:val="yellow"/>
               </w:rPr>
               <m:t>-</m:t>
             </m:r>
             <m:r>
               <w:rPr>
                 <w:rFonts w:ascii="Cambria Math" w:hAnsi="Cambria Math"/>
+                <w:highlight w:val="yellow"/>
               </w:rPr>
               <m:t>1</m:t>
             </m:r>
@@ -792,6 +882,9 @@
         </m:sSub>
       </m:oMath>
       <w:r>
+        <w:rPr>
+          <w:highlight w:val="yellow"/>
+        </w:rPr>
         <w:t>)</w:t>
       </w:r>
       <w:r>
@@ -956,14 +1049,24 @@
       </w:pPr>
       <w:r>
         <w:lastRenderedPageBreak/>
-        <w:t xml:space="preserve">You are training an RNN, and find that your weights and activations are all taking on the value of </w:t>
-      </w:r>
+        <w:t xml:space="preserve">You are training an </w:t>
+      </w:r>
+      <w:proofErr w:type="gramStart"/>
+      <w:r>
+        <w:t>RNN, and</w:t>
+      </w:r>
+      <w:proofErr w:type="gramEnd"/>
+      <w:r>
+        <w:t xml:space="preserve"> find that your weights and activations are all taking on the value of </w:t>
+      </w:r>
+      <w:proofErr w:type="spellStart"/>
       <w:r>
         <w:rPr>
           <w:rStyle w:val="VerbatimChar"/>
         </w:rPr>
         <w:t>NaN</w:t>
       </w:r>
+      <w:proofErr w:type="spellEnd"/>
       <w:r>
         <w:t xml:space="preserve"> (“Not a Number”). Which of these is the most likely cause of this problem?</w:t>
       </w:r>
@@ -994,11 +1097,15 @@
           </m:rPr>
           <w:rPr>
             <w:rFonts w:ascii="Cambria Math" w:hAnsi="Cambria Math"/>
+            <w:highlight w:val="yellow"/>
           </w:rPr>
           <m:t>▫</m:t>
         </m:r>
       </m:oMath>
       <w:r>
+        <w:rPr>
+          <w:highlight w:val="yellow"/>
+        </w:rPr>
         <w:t xml:space="preserve"> Exploding gradient problem.</w:t>
       </w:r>
       <w:r>
@@ -1045,6 +1152,9 @@
           <w:ilvl w:val="0"/>
           <w:numId w:val="3"/>
         </w:numPr>
+        <w:rPr>
+          <w:highlight w:val="yellow"/>
+        </w:rPr>
       </w:pPr>
       <w:r>
         <w:t xml:space="preserve">You’re done training an RNN language model. You’re usig it to sample random sentences as follows. What are you doing at each time step </w:t>
@@ -1164,11 +1274,15 @@
           </m:rPr>
           <w:rPr>
             <w:rFonts w:ascii="Cambria Math" w:hAnsi="Cambria Math"/>
+            <w:highlight w:val="yellow"/>
           </w:rPr>
           <m:t>▫</m:t>
         </m:r>
       </m:oMath>
       <w:r>
+        <w:rPr>
+          <w:highlight w:val="yellow"/>
+        </w:rPr>
         <w:t xml:space="preserve"> (i) Use the probabilities output by the RNN to pick the highest probability word for that time-step as </w:t>
       </w:r>
       <m:oMath>
@@ -1177,6 +1291,7 @@
             <m:ctrlPr>
               <w:rPr>
                 <w:rFonts w:ascii="Cambria Math" w:hAnsi="Cambria Math"/>
+                <w:highlight w:val="yellow"/>
               </w:rPr>
             </m:ctrlPr>
           </m:sSubPr>
@@ -1184,6 +1299,7 @@
             <m:r>
               <w:rPr>
                 <w:rFonts w:ascii="Cambria Math" w:hAnsi="Cambria Math"/>
+                <w:highlight w:val="yellow"/>
               </w:rPr>
               <m:t>y</m:t>
             </m:r>
@@ -1192,6 +1308,7 @@
             <m:r>
               <w:rPr>
                 <w:rFonts w:ascii="Cambria Math" w:hAnsi="Cambria Math"/>
+                <w:highlight w:val="yellow"/>
               </w:rPr>
               <m:t>t</m:t>
             </m:r>
@@ -1199,9 +1316,15 @@
         </m:sSub>
       </m:oMath>
       <w:r>
+        <w:rPr>
+          <w:highlight w:val="yellow"/>
+        </w:rPr>
         <w:t>. (ii) Then pass this selected word to the next time-step.</w:t>
       </w:r>
       <w:r>
+        <w:rPr>
+          <w:highlight w:val="yellow"/>
+        </w:rPr>
         <w:br/>
       </w:r>
       <m:oMath>
@@ -1211,11 +1334,15 @@
           </m:rPr>
           <w:rPr>
             <w:rFonts w:ascii="Cambria Math" w:hAnsi="Cambria Math"/>
+            <w:highlight w:val="yellow"/>
           </w:rPr>
           <m:t>▫</m:t>
         </m:r>
       </m:oMath>
       <w:r>
+        <w:rPr>
+          <w:highlight w:val="yellow"/>
+        </w:rPr>
         <w:t xml:space="preserve"> (i) Use the probabilities output by the RNN to randomly sample a chosen word for that time-step as </w:t>
       </w:r>
       <m:oMath>
@@ -1224,6 +1351,7 @@
             <m:ctrlPr>
               <w:rPr>
                 <w:rFonts w:ascii="Cambria Math" w:hAnsi="Cambria Math"/>
+                <w:highlight w:val="yellow"/>
               </w:rPr>
             </m:ctrlPr>
           </m:sSubPr>
@@ -1231,6 +1359,7 @@
             <m:r>
               <w:rPr>
                 <w:rFonts w:ascii="Cambria Math" w:hAnsi="Cambria Math"/>
+                <w:highlight w:val="yellow"/>
               </w:rPr>
               <m:t>y</m:t>
             </m:r>
@@ -1239,6 +1368,7 @@
             <m:r>
               <w:rPr>
                 <w:rFonts w:ascii="Cambria Math" w:hAnsi="Cambria Math"/>
+                <w:highlight w:val="yellow"/>
               </w:rPr>
               <m:t>t</m:t>
             </m:r>
@@ -1246,6 +1376,9 @@
         </m:sSub>
       </m:oMath>
       <w:r>
+        <w:rPr>
+          <w:highlight w:val="yellow"/>
+        </w:rPr>
         <w:t>. (ii) Then pass this selected word to the next time-step.</w:t>
       </w:r>
     </w:p>
@@ -1468,11 +1601,15 @@
           </m:rPr>
           <w:rPr>
             <w:rFonts w:ascii="Cambria Math" w:hAnsi="Cambria Math"/>
+            <w:highlight w:val="yellow"/>
           </w:rPr>
           <m:t>▫</m:t>
         </m:r>
       </m:oMath>
       <w:r>
+        <w:rPr>
+          <w:highlight w:val="yellow"/>
+        </w:rPr>
         <w:t xml:space="preserve"> Unidirectional RNN, because the value of </w:t>
       </w:r>
       <m:oMath>
@@ -1481,6 +1618,7 @@
             <m:ctrlPr>
               <w:rPr>
                 <w:rFonts w:ascii="Cambria Math" w:hAnsi="Cambria Math"/>
+                <w:highlight w:val="yellow"/>
               </w:rPr>
             </m:ctrlPr>
           </m:sSubPr>
@@ -1488,6 +1626,7 @@
             <m:r>
               <w:rPr>
                 <w:rFonts w:ascii="Cambria Math" w:hAnsi="Cambria Math"/>
+                <w:highlight w:val="yellow"/>
               </w:rPr>
               <m:t>y</m:t>
             </m:r>
@@ -1496,6 +1635,7 @@
             <m:r>
               <w:rPr>
                 <w:rFonts w:ascii="Cambria Math" w:hAnsi="Cambria Math"/>
+                <w:highlight w:val="yellow"/>
               </w:rPr>
               <m:t>t</m:t>
             </m:r>
@@ -1503,6 +1643,9 @@
         </m:sSub>
       </m:oMath>
       <w:r>
+        <w:rPr>
+          <w:highlight w:val="yellow"/>
+        </w:rPr>
         <w:t xml:space="preserve"> depends only on </w:t>
       </w:r>
       <m:oMath>
@@ -1511,6 +1654,7 @@
             <m:ctrlPr>
               <w:rPr>
                 <w:rFonts w:ascii="Cambria Math" w:hAnsi="Cambria Math"/>
+                <w:highlight w:val="yellow"/>
               </w:rPr>
             </m:ctrlPr>
           </m:sSubPr>
@@ -1518,6 +1662,7 @@
             <m:r>
               <w:rPr>
                 <w:rFonts w:ascii="Cambria Math" w:hAnsi="Cambria Math"/>
+                <w:highlight w:val="yellow"/>
               </w:rPr>
               <m:t>x</m:t>
             </m:r>
@@ -1526,6 +1671,7 @@
             <m:r>
               <w:rPr>
                 <w:rFonts w:ascii="Cambria Math" w:hAnsi="Cambria Math"/>
+                <w:highlight w:val="yellow"/>
               </w:rPr>
               <m:t>1</m:t>
             </m:r>
@@ -1537,6 +1683,7 @@
           </m:rPr>
           <w:rPr>
             <w:rFonts w:ascii="Cambria Math" w:hAnsi="Cambria Math"/>
+            <w:highlight w:val="yellow"/>
           </w:rPr>
           <m:t>,...,</m:t>
         </m:r>
@@ -1545,6 +1692,7 @@
             <m:ctrlPr>
               <w:rPr>
                 <w:rFonts w:ascii="Cambria Math" w:hAnsi="Cambria Math"/>
+                <w:highlight w:val="yellow"/>
               </w:rPr>
             </m:ctrlPr>
           </m:sSubPr>
@@ -1552,6 +1700,7 @@
             <m:r>
               <w:rPr>
                 <w:rFonts w:ascii="Cambria Math" w:hAnsi="Cambria Math"/>
+                <w:highlight w:val="yellow"/>
               </w:rPr>
               <m:t>x</m:t>
             </m:r>
@@ -1560,6 +1709,7 @@
             <m:r>
               <w:rPr>
                 <w:rFonts w:ascii="Cambria Math" w:hAnsi="Cambria Math"/>
+                <w:highlight w:val="yellow"/>
               </w:rPr>
               <m:t>t</m:t>
             </m:r>
@@ -1567,6 +1717,9 @@
         </m:sSub>
       </m:oMath>
       <w:r>
+        <w:rPr>
+          <w:highlight w:val="yellow"/>
+        </w:rPr>
         <w:t xml:space="preserve"> but not on </w:t>
       </w:r>
       <m:oMath>
@@ -1575,6 +1728,7 @@
             <m:ctrlPr>
               <w:rPr>
                 <w:rFonts w:ascii="Cambria Math" w:hAnsi="Cambria Math"/>
+                <w:highlight w:val="yellow"/>
               </w:rPr>
             </m:ctrlPr>
           </m:sSubPr>
@@ -1582,6 +1736,7 @@
             <m:r>
               <w:rPr>
                 <w:rFonts w:ascii="Cambria Math" w:hAnsi="Cambria Math"/>
+                <w:highlight w:val="yellow"/>
               </w:rPr>
               <m:t>x</m:t>
             </m:r>
@@ -1590,6 +1745,7 @@
             <m:r>
               <w:rPr>
                 <w:rFonts w:ascii="Cambria Math" w:hAnsi="Cambria Math"/>
+                <w:highlight w:val="yellow"/>
               </w:rPr>
               <m:t>t</m:t>
             </m:r>
@@ -1599,12 +1755,14 @@
               </m:rPr>
               <w:rPr>
                 <w:rFonts w:ascii="Cambria Math" w:hAnsi="Cambria Math"/>
+                <w:highlight w:val="yellow"/>
               </w:rPr>
               <m:t>+</m:t>
             </m:r>
             <m:r>
               <w:rPr>
                 <w:rFonts w:ascii="Cambria Math" w:hAnsi="Cambria Math"/>
+                <w:highlight w:val="yellow"/>
               </w:rPr>
               <m:t>1</m:t>
             </m:r>
@@ -1616,6 +1774,7 @@
           </m:rPr>
           <w:rPr>
             <w:rFonts w:ascii="Cambria Math" w:hAnsi="Cambria Math"/>
+            <w:highlight w:val="yellow"/>
           </w:rPr>
           <m:t>,...,</m:t>
         </m:r>
@@ -1624,6 +1783,7 @@
             <m:ctrlPr>
               <w:rPr>
                 <w:rFonts w:ascii="Cambria Math" w:hAnsi="Cambria Math"/>
+                <w:highlight w:val="yellow"/>
               </w:rPr>
             </m:ctrlPr>
           </m:sSubPr>
@@ -1631,6 +1791,7 @@
             <m:r>
               <w:rPr>
                 <w:rFonts w:ascii="Cambria Math" w:hAnsi="Cambria Math"/>
+                <w:highlight w:val="yellow"/>
               </w:rPr>
               <m:t>x</m:t>
             </m:r>
@@ -1639,6 +1800,7 @@
             <m:r>
               <w:rPr>
                 <w:rFonts w:ascii="Cambria Math" w:hAnsi="Cambria Math"/>
+                <w:highlight w:val="yellow"/>
               </w:rPr>
               <m:t>42</m:t>
             </m:r>
@@ -1732,16 +1894,16 @@
         </w:rPr>
         <w:lastRenderedPageBreak/>
         <w:drawing>
-          <wp:inline distT="0" distB="0" distL="0" distR="0" wp14:anchorId="0ACE5439" wp14:editId="0ACE543A">
+          <wp:inline distT="0" distB="0" distL="0" distR="0" wp14:anchorId="4685F88D" wp14:editId="6D7C122D">
             <wp:extent cx="5334000" cy="2472343"/>
             <wp:effectExtent l="0" t="0" r="0" b="0"/>
-            <wp:docPr id="21" name="Picture"/>
+            <wp:docPr id="21" name="Picture" descr="A diagram of a process flow&#10;&#10;AI-generated content may be incorrect."/>
             <wp:cNvGraphicFramePr/>
             <a:graphic xmlns:a="http://schemas.openxmlformats.org/drawingml/2006/main">
               <a:graphicData uri="http://schemas.openxmlformats.org/drawingml/2006/picture">
                 <pic:pic xmlns:pic="http://schemas.openxmlformats.org/drawingml/2006/picture">
                   <pic:nvPicPr>
-                    <pic:cNvPr id="22" name="Picture" descr="figures/enc-dec.png"/>
+                    <pic:cNvPr id="21" name="Picture" descr="A diagram of a process flow&#10;&#10;AI-generated content may be incorrect."/>
                     <pic:cNvPicPr>
                       <a:picLocks noChangeAspect="1" noChangeArrowheads="1"/>
                     </pic:cNvPicPr>
@@ -1824,7 +1986,13 @@
         </m:r>
       </m:oMath>
       <w:r>
-        <w:t xml:space="preserve"> False</w:t>
+        <w:t xml:space="preserve"> </w:t>
+      </w:r>
+      <w:r>
+        <w:rPr>
+          <w:highlight w:val="yellow"/>
+        </w:rPr>
+        <w:t>False</w:t>
       </w:r>
       <w:r>
         <w:br/>
@@ -1850,11 +2018,15 @@
           </m:rPr>
           <w:rPr>
             <w:rFonts w:ascii="Cambria Math" w:hAnsi="Cambria Math"/>
+            <w:highlight w:val="yellow"/>
           </w:rPr>
           <m:t>▫</m:t>
         </m:r>
       </m:oMath>
       <w:r>
+        <w:rPr>
+          <w:highlight w:val="yellow"/>
+        </w:rPr>
         <w:t xml:space="preserve"> The input sequence length is large.</w:t>
       </w:r>
       <w:r>
@@ -1903,10 +2075,7 @@
         </m:r>
       </m:oMath>
       <w:r>
-        <w:t xml:space="preserve"> </w:t>
-      </w:r>
-      <w:r>
-        <w:t>A component of the base Transformer network that redirects tensors to their correct layers</w:t>
+        <w:t xml:space="preserve"> A component of the base Transformer network that redirects tensors to their correct layers</w:t>
       </w:r>
       <w:r>
         <w:br/>
@@ -1935,11 +2104,15 @@
           </m:rPr>
           <w:rPr>
             <w:rFonts w:ascii="Cambria Math" w:hAnsi="Cambria Math"/>
+            <w:highlight w:val="yellow"/>
           </w:rPr>
           <m:t>▫</m:t>
         </m:r>
       </m:oMath>
       <w:r>
+        <w:rPr>
+          <w:highlight w:val="yellow"/>
+        </w:rPr>
         <w:t xml:space="preserve"> An additional component, usually made up of one or a few layers, to convert the transformer predictions to a task-specific output</w:t>
       </w:r>
       <w:r>
@@ -1966,11 +2139,15 @@
           </m:rPr>
           <w:rPr>
             <w:rFonts w:ascii="Cambria Math" w:hAnsi="Cambria Math"/>
+            <w:highlight w:val="yellow"/>
           </w:rPr>
           <m:t>▫</m:t>
         </m:r>
       </m:oMath>
       <w:r>
+        <w:rPr>
+          <w:highlight w:val="yellow"/>
+        </w:rPr>
         <w:t xml:space="preserve"> Truncating </w:t>
       </w:r>
       <m:oMath>
@@ -1980,11 +2157,15 @@
           </m:rPr>
           <w:rPr>
             <w:rFonts w:ascii="Cambria Math" w:hAnsi="Cambria Math"/>
+            <w:highlight w:val="yellow"/>
           </w:rPr>
           <m:t>▫</m:t>
         </m:r>
       </m:oMath>
       <w:r>
+        <w:rPr>
+          <w:highlight w:val="yellow"/>
+        </w:rPr>
         <w:t xml:space="preserve"> Returning tensors </w:t>
       </w:r>
       <m:oMath>
@@ -1994,11 +2175,15 @@
           </m:rPr>
           <w:rPr>
             <w:rFonts w:ascii="Cambria Math" w:hAnsi="Cambria Math"/>
+            <w:highlight w:val="yellow"/>
           </w:rPr>
           <m:t>▫</m:t>
         </m:r>
       </m:oMath>
       <w:r>
+        <w:rPr>
+          <w:highlight w:val="yellow"/>
+        </w:rPr>
         <w:t xml:space="preserve"> Padding </w:t>
       </w:r>
       <m:oMath>
@@ -2008,11 +2193,15 @@
           </m:rPr>
           <w:rPr>
             <w:rFonts w:ascii="Cambria Math" w:hAnsi="Cambria Math"/>
+            <w:highlight w:val="yellow"/>
           </w:rPr>
           <m:t>▫</m:t>
         </m:r>
       </m:oMath>
       <w:r>
+        <w:rPr>
+          <w:highlight w:val="yellow"/>
+        </w:rPr>
         <w:t xml:space="preserve"> Attention masking</w:t>
       </w:r>
       <w:r>
@@ -2381,16 +2570,7 @@
           <w:rPr>
             <w:rFonts w:ascii="Cambria Math" w:hAnsi="Cambria Math"/>
           </w:rPr>
-          <m:t>-</m:t>
-        </m:r>
-        <m:r>
-          <m:rPr>
-            <m:sty m:val="p"/>
-          </m:rPr>
-          <w:rPr>
-            <w:rFonts w:ascii="Cambria Math" w:hAnsi="Cambria Math"/>
-          </w:rPr>
-          <m:t>exp</m:t>
+          <m:t>-exp</m:t>
         </m:r>
         <m:d>
           <m:dPr>
@@ -2740,10 +2920,7 @@
         </m:d>
       </m:oMath>
       <w:r>
-        <w:t xml:space="preserve"> </w:t>
-      </w:r>
-      <w:r>
-        <w:t xml:space="preserve">after logit bias added. Given these connections between the two distributions, you can infer </w:t>
+        <w:t xml:space="preserve"> after logit bias added. Given these connections between the two distributions, you can infer </w:t>
       </w:r>
       <m:oMath>
         <m:r>
@@ -3102,13 +3279,7 @@
                       <w:rPr>
                         <w:rFonts w:ascii="Cambria Math" w:hAnsi="Cambria Math"/>
                       </w:rPr>
-                      <m:t>h</m:t>
-                    </m:r>
-                    <m:r>
-                      <w:rPr>
-                        <w:rFonts w:ascii="Cambria Math" w:hAnsi="Cambria Math"/>
-                      </w:rPr>
-                      <m:t>x</m:t>
+                      <m:t>hx</m:t>
                     </m:r>
                   </m:sub>
                 </m:sSub>
@@ -3265,13 +3436,7 @@
                       <w:rPr>
                         <w:rFonts w:ascii="Cambria Math" w:hAnsi="Cambria Math"/>
                       </w:rPr>
-                      <m:t>y</m:t>
-                    </m:r>
-                    <m:r>
-                      <w:rPr>
-                        <w:rFonts w:ascii="Cambria Math" w:hAnsi="Cambria Math"/>
-                      </w:rPr>
-                      <m:t>h</m:t>
+                      <m:t>yh</m:t>
                     </m:r>
                   </m:sub>
                 </m:sSub>
@@ -3963,13 +4128,7 @@
                       <w:rPr>
                         <w:rFonts w:ascii="Cambria Math" w:hAnsi="Cambria Math"/>
                       </w:rPr>
-                      <m:t>y</m:t>
-                    </m:r>
-                    <m:r>
-                      <w:rPr>
-                        <w:rFonts w:ascii="Cambria Math" w:hAnsi="Cambria Math"/>
-                      </w:rPr>
-                      <m:t>h</m:t>
+                      <m:t>yh</m:t>
                     </m:r>
                   </m:sub>
                 </m:sSub>
@@ -4236,13 +4395,7 @@
                       <w:rPr>
                         <w:rFonts w:ascii="Cambria Math" w:hAnsi="Cambria Math"/>
                       </w:rPr>
-                      <m:t>h</m:t>
-                    </m:r>
-                    <m:r>
-                      <w:rPr>
-                        <w:rFonts w:ascii="Cambria Math" w:hAnsi="Cambria Math"/>
-                      </w:rPr>
-                      <m:t>x</m:t>
+                      <m:t>hx</m:t>
                     </m:r>
                   </m:sub>
                 </m:sSub>
@@ -4311,10 +4464,7 @@
         </m:r>
       </m:oMath>
       <w:r>
-        <w:t xml:space="preserve"> </w:t>
-      </w:r>
-      <w:r>
-        <w:t>is the identity activation (i.e. no activation).</w:t>
+        <w:t xml:space="preserve"> is the identity activation (i.e. no activation).</w:t>
       </w:r>
     </w:p>
     <w:p>
@@ -4404,8 +4554,8 @@
         <w:pStyle w:val="Heading2"/>
       </w:pPr>
       <w:bookmarkStart w:id="5" w:name="backprop-for-rnn"/>
+      <w:bookmarkEnd w:id="3"/>
       <w:bookmarkEnd w:id="4"/>
-      <w:bookmarkEnd w:id="3"/>
       <w:r>
         <w:t>Backprop for RNN</w:t>
       </w:r>
@@ -4524,13 +4674,7 @@
               <w:rPr>
                 <w:rFonts w:ascii="Cambria Math" w:hAnsi="Cambria Math"/>
               </w:rPr>
-              <m:t>y</m:t>
-            </m:r>
-            <m:r>
-              <w:rPr>
-                <w:rFonts w:ascii="Cambria Math" w:hAnsi="Cambria Math"/>
-              </w:rPr>
-              <m:t>h</m:t>
+              <m:t>yh</m:t>
             </m:r>
           </m:sub>
         </m:sSub>
@@ -4927,6 +5071,43 @@
       <w:r>
         <w:br/>
       </w:r>
+      <w:r>
+        <w:drawing>
+          <wp:inline distT="0" distB="0" distL="0" distR="0" wp14:anchorId="0971AFD9" wp14:editId="4B7F3F62">
+            <wp:extent cx="5943600" cy="1588135"/>
+            <wp:effectExtent l="0" t="0" r="0" b="0"/>
+            <wp:docPr id="1261981350" name="Picture 1" descr="A math equations on a white background&#10;&#10;AI-generated content may be incorrect."/>
+            <wp:cNvGraphicFramePr>
+              <a:graphicFrameLocks xmlns:a="http://schemas.openxmlformats.org/drawingml/2006/main" noChangeAspect="1"/>
+            </wp:cNvGraphicFramePr>
+            <a:graphic xmlns:a="http://schemas.openxmlformats.org/drawingml/2006/main">
+              <a:graphicData uri="http://schemas.openxmlformats.org/drawingml/2006/picture">
+                <pic:pic xmlns:pic="http://schemas.openxmlformats.org/drawingml/2006/picture">
+                  <pic:nvPicPr>
+                    <pic:cNvPr id="1261981350" name="Picture 1" descr="A math equations on a white background&#10;&#10;AI-generated content may be incorrect."/>
+                    <pic:cNvPicPr/>
+                  </pic:nvPicPr>
+                  <pic:blipFill>
+                    <a:blip r:embed="rId13"/>
+                    <a:stretch>
+                      <a:fillRect/>
+                    </a:stretch>
+                  </pic:blipFill>
+                  <pic:spPr>
+                    <a:xfrm>
+                      <a:off x="0" y="0"/>
+                      <a:ext cx="5943600" cy="1588135"/>
+                    </a:xfrm>
+                    <a:prstGeom prst="rect">
+                      <a:avLst/>
+                    </a:prstGeom>
+                  </pic:spPr>
+                </pic:pic>
+              </a:graphicData>
+            </a:graphic>
+          </wp:inline>
+        </w:drawing>
+      </w:r>
     </w:p>
     <w:p>
       <w:pPr>
@@ -5304,10 +5485,55 @@
         </m:sSub>
       </m:oMath>
       <w:r>
-        <w:t xml:space="preserve"> and the aforementioned variables and show your work.</w:t>
+        <w:t xml:space="preserve"> and the </w:t>
+      </w:r>
+      <w:proofErr w:type="gramStart"/>
+      <w:r>
+        <w:t>aforementioned variables</w:t>
+      </w:r>
+      <w:proofErr w:type="gramEnd"/>
+      <w:r>
+        <w:t xml:space="preserve"> and show your work.</w:t>
       </w:r>
       <w:r>
         <w:br/>
+      </w:r>
+      <w:r>
+        <w:drawing>
+          <wp:inline distT="0" distB="0" distL="0" distR="0" wp14:anchorId="02CEF756" wp14:editId="00DF5DB4">
+            <wp:extent cx="5010281" cy="2501393"/>
+            <wp:effectExtent l="0" t="0" r="0" b="0"/>
+            <wp:docPr id="1289341310" name="Picture 1" descr="A math equations and formulas&#10;&#10;AI-generated content may be incorrect."/>
+            <wp:cNvGraphicFramePr>
+              <a:graphicFrameLocks xmlns:a="http://schemas.openxmlformats.org/drawingml/2006/main" noChangeAspect="1"/>
+            </wp:cNvGraphicFramePr>
+            <a:graphic xmlns:a="http://schemas.openxmlformats.org/drawingml/2006/main">
+              <a:graphicData uri="http://schemas.openxmlformats.org/drawingml/2006/picture">
+                <pic:pic xmlns:pic="http://schemas.openxmlformats.org/drawingml/2006/picture">
+                  <pic:nvPicPr>
+                    <pic:cNvPr id="1289341310" name="Picture 1" descr="A math equations and formulas&#10;&#10;AI-generated content may be incorrect."/>
+                    <pic:cNvPicPr/>
+                  </pic:nvPicPr>
+                  <pic:blipFill>
+                    <a:blip r:embed="rId14"/>
+                    <a:stretch>
+                      <a:fillRect/>
+                    </a:stretch>
+                  </pic:blipFill>
+                  <pic:spPr>
+                    <a:xfrm>
+                      <a:off x="0" y="0"/>
+                      <a:ext cx="5059451" cy="2525941"/>
+                    </a:xfrm>
+                    <a:prstGeom prst="rect">
+                      <a:avLst/>
+                    </a:prstGeom>
+                  </pic:spPr>
+                </pic:pic>
+              </a:graphicData>
+            </a:graphic>
+          </wp:inline>
+        </w:drawing>
       </w:r>
     </w:p>
     <w:p>
@@ -5606,10 +5832,51 @@
         </m:sSub>
       </m:oMath>
       <w:r>
-        <w:t xml:space="preserve"> and the aforementioned variables. Show your work in the second.</w:t>
+        <w:t xml:space="preserve"> and the aforementioned variables. Show your work in the </w:t>
+      </w:r>
+      <w:r>
+        <w:lastRenderedPageBreak/>
+        <w:t>second.</w:t>
       </w:r>
       <w:r>
         <w:br/>
+      </w:r>
+      <w:r>
+        <w:drawing>
+          <wp:inline distT="0" distB="0" distL="0" distR="0" wp14:anchorId="7507A18E" wp14:editId="3C011BB1">
+            <wp:extent cx="5943600" cy="1465580"/>
+            <wp:effectExtent l="0" t="0" r="0" b="0"/>
+            <wp:docPr id="1161047994" name="Picture 1" descr="A math equation with a number of letters&#10;&#10;AI-generated content may be incorrect."/>
+            <wp:cNvGraphicFramePr>
+              <a:graphicFrameLocks xmlns:a="http://schemas.openxmlformats.org/drawingml/2006/main" noChangeAspect="1"/>
+            </wp:cNvGraphicFramePr>
+            <a:graphic xmlns:a="http://schemas.openxmlformats.org/drawingml/2006/main">
+              <a:graphicData uri="http://schemas.openxmlformats.org/drawingml/2006/picture">
+                <pic:pic xmlns:pic="http://schemas.openxmlformats.org/drawingml/2006/picture">
+                  <pic:nvPicPr>
+                    <pic:cNvPr id="1161047994" name="Picture 1" descr="A math equation with a number of letters&#10;&#10;AI-generated content may be incorrect."/>
+                    <pic:cNvPicPr/>
+                  </pic:nvPicPr>
+                  <pic:blipFill>
+                    <a:blip r:embed="rId15"/>
+                    <a:stretch>
+                      <a:fillRect/>
+                    </a:stretch>
+                  </pic:blipFill>
+                  <pic:spPr>
+                    <a:xfrm>
+                      <a:off x="0" y="0"/>
+                      <a:ext cx="5943600" cy="1465580"/>
+                    </a:xfrm>
+                    <a:prstGeom prst="rect">
+                      <a:avLst/>
+                    </a:prstGeom>
+                  </pic:spPr>
+                </pic:pic>
+              </a:graphicData>
+            </a:graphic>
+          </wp:inline>
+        </w:drawing>
       </w:r>
     </w:p>
     <w:p>
@@ -5915,6 +6182,43 @@
       <w:r>
         <w:br/>
       </w:r>
+      <w:r>
+        <w:drawing>
+          <wp:inline distT="0" distB="0" distL="0" distR="0" wp14:anchorId="4C39E935" wp14:editId="6049B758">
+            <wp:extent cx="5943600" cy="1597660"/>
+            <wp:effectExtent l="0" t="0" r="0" b="0"/>
+            <wp:docPr id="1726945514" name="Picture 1" descr="A mathematical equation with numbers&#10;&#10;AI-generated content may be incorrect."/>
+            <wp:cNvGraphicFramePr>
+              <a:graphicFrameLocks xmlns:a="http://schemas.openxmlformats.org/drawingml/2006/main" noChangeAspect="1"/>
+            </wp:cNvGraphicFramePr>
+            <a:graphic xmlns:a="http://schemas.openxmlformats.org/drawingml/2006/main">
+              <a:graphicData uri="http://schemas.openxmlformats.org/drawingml/2006/picture">
+                <pic:pic xmlns:pic="http://schemas.openxmlformats.org/drawingml/2006/picture">
+                  <pic:nvPicPr>
+                    <pic:cNvPr id="1726945514" name="Picture 1" descr="A mathematical equation with numbers&#10;&#10;AI-generated content may be incorrect."/>
+                    <pic:cNvPicPr/>
+                  </pic:nvPicPr>
+                  <pic:blipFill>
+                    <a:blip r:embed="rId16"/>
+                    <a:stretch>
+                      <a:fillRect/>
+                    </a:stretch>
+                  </pic:blipFill>
+                  <pic:spPr>
+                    <a:xfrm>
+                      <a:off x="0" y="0"/>
+                      <a:ext cx="5943600" cy="1597660"/>
+                    </a:xfrm>
+                    <a:prstGeom prst="rect">
+                      <a:avLst/>
+                    </a:prstGeom>
+                  </pic:spPr>
+                </pic:pic>
+              </a:graphicData>
+            </a:graphic>
+          </wp:inline>
+        </w:drawing>
+      </w:r>
     </w:p>
     <w:p>
       <w:pPr>
@@ -5929,8 +6233,8 @@
         <w:pStyle w:val="Heading1"/>
       </w:pPr>
       <w:bookmarkStart w:id="6" w:name="self-attention-and-transformers"/>
+      <w:bookmarkEnd w:id="2"/>
       <w:bookmarkEnd w:id="5"/>
-      <w:bookmarkEnd w:id="2"/>
       <w:r>
         <w:t>Self-Attention and Transformers</w:t>
       </w:r>
@@ -6231,7 +6535,6 @@
             <m:rPr>
               <m:nor/>
             </m:rPr>
-            <w:lastRenderedPageBreak/>
             <m:t>Attention</m:t>
           </m:r>
           <m:sSub>
@@ -6921,6 +7224,7 @@
           <w:rPr>
             <w:rFonts w:ascii="Cambria Math" w:hAnsi="Cambria Math"/>
           </w:rPr>
+          <w:lastRenderedPageBreak/>
           <m:t>h</m:t>
         </m:r>
       </m:oMath>
@@ -7291,10 +7595,7 @@
         </m:sSup>
       </m:oMath>
       <w:r>
-        <w:t xml:space="preserve"> </w:t>
-      </w:r>
-      <w:r>
-        <w:t>are the projection matrices to build query, key and value representations;</w:t>
+        <w:t xml:space="preserve"> are the projection matrices to build query, key and value representations;</w:t>
       </w:r>
     </w:p>
     <w:p>
@@ -8152,6 +8453,43 @@
       <w:r>
         <w:br/>
       </w:r>
+      <w:r>
+        <w:drawing>
+          <wp:inline distT="0" distB="0" distL="0" distR="0" wp14:anchorId="6899DCD6" wp14:editId="798B51DC">
+            <wp:extent cx="5943600" cy="2788285"/>
+            <wp:effectExtent l="0" t="0" r="0" b="0"/>
+            <wp:docPr id="1068731744" name="Picture 1"/>
+            <wp:cNvGraphicFramePr>
+              <a:graphicFrameLocks xmlns:a="http://schemas.openxmlformats.org/drawingml/2006/main" noChangeAspect="1"/>
+            </wp:cNvGraphicFramePr>
+            <a:graphic xmlns:a="http://schemas.openxmlformats.org/drawingml/2006/main">
+              <a:graphicData uri="http://schemas.openxmlformats.org/drawingml/2006/picture">
+                <pic:pic xmlns:pic="http://schemas.openxmlformats.org/drawingml/2006/picture">
+                  <pic:nvPicPr>
+                    <pic:cNvPr id="1068731744" name=""/>
+                    <pic:cNvPicPr/>
+                  </pic:nvPicPr>
+                  <pic:blipFill>
+                    <a:blip r:embed="rId17"/>
+                    <a:stretch>
+                      <a:fillRect/>
+                    </a:stretch>
+                  </pic:blipFill>
+                  <pic:spPr>
+                    <a:xfrm>
+                      <a:off x="0" y="0"/>
+                      <a:ext cx="5943600" cy="2788285"/>
+                    </a:xfrm>
+                    <a:prstGeom prst="rect">
+                      <a:avLst/>
+                    </a:prstGeom>
+                  </pic:spPr>
+                </pic:pic>
+              </a:graphicData>
+            </a:graphic>
+          </wp:inline>
+        </w:drawing>
+      </w:r>
     </w:p>
     <w:p>
       <w:pPr>
@@ -8342,13 +8680,51 @@
         </m:sSub>
       </m:oMath>
       <w:r>
-        <w:t xml:space="preserve">. </w:t>
-      </w:r>
-      <w:r>
-        <w:t>Describe one way we can go about implementing such masking.</w:t>
+        <w:t xml:space="preserve">. Describe one way we can go </w:t>
+      </w:r>
+      <w:r>
+        <w:lastRenderedPageBreak/>
+        <w:t>about implementing such masking.</w:t>
       </w:r>
       <w:r>
         <w:br/>
+      </w:r>
+      <w:r>
+        <w:drawing>
+          <wp:inline distT="0" distB="0" distL="0" distR="0" wp14:anchorId="4444DCF1" wp14:editId="6A38F205">
+            <wp:extent cx="5943600" cy="1207770"/>
+            <wp:effectExtent l="0" t="0" r="0" b="0"/>
+            <wp:docPr id="330943340" name="Picture 1"/>
+            <wp:cNvGraphicFramePr>
+              <a:graphicFrameLocks xmlns:a="http://schemas.openxmlformats.org/drawingml/2006/main" noChangeAspect="1"/>
+            </wp:cNvGraphicFramePr>
+            <a:graphic xmlns:a="http://schemas.openxmlformats.org/drawingml/2006/main">
+              <a:graphicData uri="http://schemas.openxmlformats.org/drawingml/2006/picture">
+                <pic:pic xmlns:pic="http://schemas.openxmlformats.org/drawingml/2006/picture">
+                  <pic:nvPicPr>
+                    <pic:cNvPr id="330943340" name=""/>
+                    <pic:cNvPicPr/>
+                  </pic:nvPicPr>
+                  <pic:blipFill>
+                    <a:blip r:embed="rId18"/>
+                    <a:stretch>
+                      <a:fillRect/>
+                    </a:stretch>
+                  </pic:blipFill>
+                  <pic:spPr>
+                    <a:xfrm>
+                      <a:off x="0" y="0"/>
+                      <a:ext cx="5943600" cy="1207770"/>
+                    </a:xfrm>
+                    <a:prstGeom prst="rect">
+                      <a:avLst/>
+                    </a:prstGeom>
+                  </pic:spPr>
+                </pic:pic>
+              </a:graphicData>
+            </a:graphic>
+          </wp:inline>
+        </w:drawing>
       </w:r>
     </w:p>
     <w:p>
@@ -8362,7 +8738,6 @@
           <w:b/>
           <w:bCs/>
         </w:rPr>
-        <w:lastRenderedPageBreak/>
         <w:t>Extra Credit:</w:t>
       </w:r>
       <w:r>
@@ -8532,13 +8907,7 @@
               <w:rPr>
                 <w:rFonts w:ascii="Cambria Math" w:hAnsi="Cambria Math"/>
               </w:rPr>
-              <m:t>nk</m:t>
-            </m:r>
-            <m:r>
-              <w:rPr>
-                <w:rFonts w:ascii="Cambria Math" w:hAnsi="Cambria Math"/>
-              </w:rPr>
-              <m:t>h</m:t>
+              <m:t>nkh</m:t>
             </m:r>
           </m:e>
         </m:d>
@@ -8905,13 +9274,7 @@
               <w:rPr>
                 <w:rFonts w:ascii="Cambria Math" w:hAnsi="Cambria Math"/>
               </w:rPr>
-              <m:t>nk</m:t>
-            </m:r>
-            <m:r>
-              <w:rPr>
-                <w:rFonts w:ascii="Cambria Math" w:hAnsi="Cambria Math"/>
-              </w:rPr>
-              <m:t>h</m:t>
+              <m:t>nkh</m:t>
             </m:r>
           </m:e>
         </m:d>
@@ -8938,8 +9301,8 @@
         <w:pStyle w:val="Heading1"/>
       </w:pPr>
       <w:bookmarkStart w:id="11" w:name="programming"/>
+      <w:bookmarkEnd w:id="6"/>
       <w:bookmarkEnd w:id="10"/>
-      <w:bookmarkEnd w:id="6"/>
       <w:r>
         <w:t>Programming</w:t>
       </w:r>
@@ -8990,7 +9353,7 @@
       <w:r>
         <w:t xml:space="preserve">The code base for this homework can be found at </w:t>
       </w:r>
-      <w:hyperlink r:id="rId13">
+      <w:hyperlink r:id="rId19">
         <w:r>
           <w:rPr>
             <w:rStyle w:val="Hyperlink"/>
@@ -9008,10 +9371,7 @@
         <w:t>hw5</w:t>
       </w:r>
       <w:r>
-        <w:t xml:space="preserve"> </w:t>
-      </w:r>
-      <w:r>
-        <w:t>directory. Your task is to fill in the missing parts in the skeleton code, following the requirements, guidance, and tips provided in this pdf and the comments in the corresponding .py files. The code base has the following structure:</w:t>
+        <w:t xml:space="preserve"> directory. Your task is to fill in the missing parts in the skeleton code, following the requirements, guidance, and tips provided in this pdf and the comments in the corresponding .py files. The code base has the following structure:</w:t>
       </w:r>
     </w:p>
     <w:p>
@@ -9076,13 +9436,11 @@
         <w:rPr>
           <w:rStyle w:val="VerbatimChar"/>
         </w:rPr>
+        <w:lastRenderedPageBreak/>
         <w:t>trainer.py</w:t>
       </w:r>
       <w:r>
-        <w:t xml:space="preserve"> </w:t>
-      </w:r>
-      <w:r>
-        <w:t>is the script for training, evaluating the GPT model, and visualizing the results.</w:t>
+        <w:t xml:space="preserve"> is the script for training, evaluating the GPT model, and visualizing the results.</w:t>
       </w:r>
     </w:p>
     <w:p>
@@ -9167,7 +9525,6 @@
         <w:rPr>
           <w:rStyle w:val="VerbatimChar"/>
         </w:rPr>
-        <w:lastRenderedPageBreak/>
         <w:t>hw5.md</w:t>
       </w:r>
       <w:r>
@@ -9336,7 +9693,7 @@
       <w:r>
         <w:t xml:space="preserve">As the architecture is so popular, there already exists a Pytorch </w:t>
       </w:r>
-      <w:hyperlink r:id="rId14">
+      <w:hyperlink r:id="rId20">
         <w:r>
           <w:rPr>
             <w:rStyle w:val="Hyperlink"/>
@@ -9353,7 +9710,7 @@
       <w:r>
         <w:t xml:space="preserve"> and a </w:t>
       </w:r>
-      <w:hyperlink r:id="rId15">
+      <w:hyperlink r:id="rId21">
         <w:r>
           <w:rPr>
             <w:rStyle w:val="Hyperlink"/>
@@ -9362,10 +9719,7 @@
         </w:r>
       </w:hyperlink>
       <w:r>
-        <w:t xml:space="preserve"> on how to use it for the next token prediction. </w:t>
-      </w:r>
-      <w:r>
-        <w:t>However, we will implement it here ourselves, to get through to the smallest details.</w:t>
+        <w:t xml:space="preserve"> on how to use it for the next token prediction. However, we will implement it here ourselves, to get through to the smallest details.</w:t>
       </w:r>
     </w:p>
     <w:p>
@@ -9383,7 +9737,7 @@
           <w:numId w:val="9"/>
         </w:numPr>
       </w:pPr>
-      <w:hyperlink r:id="rId16">
+      <w:hyperlink r:id="rId22">
         <w:r>
           <w:rPr>
             <w:rStyle w:val="Hyperlink"/>
@@ -9402,7 +9756,7 @@
           <w:numId w:val="9"/>
         </w:numPr>
       </w:pPr>
-      <w:hyperlink r:id="rId17">
+      <w:hyperlink r:id="rId23">
         <w:r>
           <w:rPr>
             <w:rStyle w:val="Hyperlink"/>
@@ -9421,7 +9775,7 @@
           <w:numId w:val="9"/>
         </w:numPr>
       </w:pPr>
-      <w:hyperlink r:id="rId18">
+      <w:hyperlink r:id="rId24">
         <w:r>
           <w:rPr>
             <w:rStyle w:val="Hyperlink"/>
@@ -9440,7 +9794,7 @@
           <w:numId w:val="9"/>
         </w:numPr>
       </w:pPr>
-      <w:hyperlink r:id="rId19">
+      <w:hyperlink r:id="rId25">
         <w:r>
           <w:rPr>
             <w:rStyle w:val="Hyperlink"/>
@@ -9459,7 +9813,7 @@
           <w:numId w:val="9"/>
         </w:numPr>
       </w:pPr>
-      <w:hyperlink r:id="rId20">
+      <w:hyperlink r:id="rId26">
         <w:r>
           <w:rPr>
             <w:rStyle w:val="Hyperlink"/>
@@ -9476,8 +9830,8 @@
         <w:pStyle w:val="Heading3"/>
       </w:pPr>
       <w:bookmarkStart w:id="17" w:name="what-is-attention"/>
+      <w:bookmarkEnd w:id="15"/>
       <w:bookmarkEnd w:id="16"/>
-      <w:bookmarkEnd w:id="15"/>
       <w:r>
         <w:t>What is Attention?</w:t>
       </w:r>
@@ -9497,10 +9851,7 @@
         <w:t>the attention mechanism describes a weighted average of (sequence) elements with the weights dynamically computed based on an input query and elements’ keys</w:t>
       </w:r>
       <w:r>
-        <w:t>. So what does this exactly mean? The goal is to take an average of the features of multiple elements. However, instead of weighting each element equally, we want to weight them depending on their actual values. In other words, we want to dynamically decide on which inputs we want to “attend" more than others. In particular, an attention mechanism has us</w:t>
-      </w:r>
-      <w:r>
-        <w:t>ually four parts we need to specify:</w:t>
+        <w:t>. So what does this exactly mean? The goal is to take an average of the features of multiple elements. However, instead of weighting each element equally, we want to weight them depending on their actual values. In other words, we want to dynamically decide on which inputs we want to “attend" more than others. In particular, an attention mechanism has usually four parts we need to specify:</w:t>
       </w:r>
     </w:p>
     <w:p>
@@ -9610,6 +9961,7 @@
         <w:pStyle w:val="FirstParagraph"/>
       </w:pPr>
       <w:r>
+        <w:lastRenderedPageBreak/>
         <w:t>The weights of the average are calculated by a Softmax overall score function outputs. Hence, we assign those value vectors a higher weight whose corresponding key is most similar to the query. If we try to describe it with pseudo-math, we can write:</w:t>
       </w:r>
     </w:p>
@@ -10018,11 +10370,7 @@
         <w:pStyle w:val="FirstParagraph"/>
       </w:pPr>
       <w:r>
-        <w:t xml:space="preserve">Visually, we can show the attention over a sequence of words as follows. For every word, we have one key and one value vector. The query is compared to all keys with a score </w:t>
-      </w:r>
-      <w:r>
-        <w:lastRenderedPageBreak/>
-        <w:t>function (in this case the dot product) to determine the weights. The Softmax is not visualized for simplicity. Finally, the value vectors of all words are averaged using the attention weights.</w:t>
+        <w:t>Visually, we can show the attention over a sequence of words as follows. For every word, we have one key and one value vector. The query is compared to all keys with a score function (in this case the dot product) to determine the weights. The Softmax is not visualized for simplicity. Finally, the value vectors of all words are averaged using the attention weights.</w:t>
       </w:r>
     </w:p>
     <w:p>
@@ -10049,7 +10397,7 @@
                     </pic:cNvPicPr>
                   </pic:nvPicPr>
                   <pic:blipFill>
-                    <a:blip r:embed="rId21"/>
+                    <a:blip r:embed="rId27"/>
                     <a:stretch>
                       <a:fillRect/>
                     </a:stretch>
@@ -10698,6 +11046,7 @@
         <w:pStyle w:val="FirstParagraph"/>
       </w:pPr>
       <w:r>
+        <w:lastRenderedPageBreak/>
         <w:t xml:space="preserve">The matrix multiplication </w:t>
       </w:r>
       <m:oMath>
@@ -10773,7 +11122,7 @@
       <w:r>
         <w:t xml:space="preserve"> to all other elements in the sequence. On these, we apply a Softmax and multiply with the value vector to obtain a weighted mean (the weights being determined by the attention). Another perspective on this attention mechanism offers the computation graph which is visualized below (figure credit: ). There is also a nice visualization of these values are computed </w:t>
       </w:r>
-      <w:hyperlink r:id="rId22">
+      <w:hyperlink r:id="rId28">
         <w:r>
           <w:rPr>
             <w:rStyle w:val="Hyperlink"/>
@@ -10793,7 +11142,6 @@
         <w:rPr>
           <w:noProof/>
         </w:rPr>
-        <w:lastRenderedPageBreak/>
         <w:drawing>
           <wp:inline distT="0" distB="0" distL="0" distR="0" wp14:anchorId="0ACE5443" wp14:editId="0ACE5444">
             <wp:extent cx="3440190" cy="4348195"/>
@@ -10810,7 +11158,7 @@
                     </pic:cNvPicPr>
                   </pic:nvPicPr>
                   <pic:blipFill>
-                    <a:blip r:embed="rId23"/>
+                    <a:blip r:embed="rId29"/>
                     <a:stretch>
                       <a:fillRect/>
                     </a:stretch>
@@ -11013,22 +11361,13 @@
           </m:sSub>
           <m:r>
             <m:rPr>
-              <m:sty m:val="p"/>
-            </m:rPr>
-            <w:rPr>
-              <w:rFonts w:ascii="Cambria Math" w:hAnsi="Cambria Math"/>
-            </w:rPr>
-            <m:t>∼</m:t>
-          </m:r>
-          <m:r>
-            <m:rPr>
               <m:scr m:val="script"/>
               <m:sty m:val="p"/>
             </m:rPr>
             <w:rPr>
               <w:rFonts w:ascii="Cambria Math" w:hAnsi="Cambria Math"/>
             </w:rPr>
-            <m:t>N</m:t>
+            <m:t>∼N</m:t>
           </m:r>
           <m:d>
             <m:dPr>
@@ -11098,22 +11437,13 @@
           </m:sSub>
           <m:r>
             <m:rPr>
-              <m:sty m:val="p"/>
-            </m:rPr>
-            <w:rPr>
-              <w:rFonts w:ascii="Cambria Math" w:hAnsi="Cambria Math"/>
-            </w:rPr>
-            <m:t>∼</m:t>
-          </m:r>
-          <m:r>
-            <m:rPr>
               <m:scr m:val="script"/>
               <m:sty m:val="p"/>
             </m:rPr>
             <w:rPr>
               <w:rFonts w:ascii="Cambria Math" w:hAnsi="Cambria Math"/>
             </w:rPr>
-            <m:t>N</m:t>
+            <m:t>∼N</m:t>
           </m:r>
           <m:d>
             <m:dPr>
@@ -11352,6 +11682,7 @@
         <w:pStyle w:val="FirstParagraph"/>
       </w:pPr>
       <w:r>
+        <w:lastRenderedPageBreak/>
         <w:t xml:space="preserve">If we do not scale down the variance back to </w:t>
       </w:r>
       <m:oMath>
@@ -11414,11 +11745,7 @@
         </m:r>
       </m:oMath>
       <w:r>
-        <w:t xml:space="preserve"> sub-</w:t>
-      </w:r>
-      <w:r>
-        <w:lastRenderedPageBreak/>
-        <w:t>queries, sub-keys, and sub-values, which we pass through the scaled dot product attention independently. Afterward, we concatenate the heads and combine them with a final weight matrix. Mathematically, we can express this operation as:</w:t>
+        <w:t xml:space="preserve"> sub-queries, sub-keys, and sub-values, which we pass through the scaled dot product attention independently. Afterward, we concatenate the heads and combine them with a final weight matrix. Mathematically, we can express this operation as:</w:t>
       </w:r>
     </w:p>
     <w:p>
@@ -12351,10 +12678,7 @@
         </m:r>
       </m:oMath>
       <w:r>
-        <w:t xml:space="preserve"> </w:t>
-      </w:r>
-      <w:r>
-        <w:t>being the input dimension). Expressed in a computational graph, we can visualize it below (figure credit: ).</w:t>
+        <w:t xml:space="preserve"> being the input dimension). Expressed in a computational graph, we can visualize it below (figure credit: ).</w:t>
       </w:r>
     </w:p>
     <w:p>
@@ -12547,7 +12871,7 @@
                     </pic:cNvPicPr>
                   </pic:nvPicPr>
                   <pic:blipFill>
-                    <a:blip r:embed="rId24"/>
+                    <a:blip r:embed="rId30"/>
                     <a:stretch>
                       <a:fillRect/>
                     </a:stretch>
@@ -12743,7 +13067,7 @@
                     </pic:cNvPicPr>
                   </pic:nvPicPr>
                   <pic:blipFill>
-                    <a:blip r:embed="rId25"/>
+                    <a:blip r:embed="rId31"/>
                     <a:stretch>
                       <a:fillRect/>
                     </a:stretch>
@@ -12961,10 +13285,7 @@
         <w:pStyle w:val="FirstParagraph"/>
       </w:pPr>
       <w:r>
-        <w:t>The Layer Normalization also plays an important role in the Transformer architecture as it enables faster training and provides small regularization. Additionally, it ensures that the features are in a similar magnitude among the elements in the sequence. We are not using Batch Normalization because it depends on the batch size which is often small with Transformers (they require a lot of GPU memory), and BatchNorm has shown to perform particularly badly in language as the features of words tend to have a m</w:t>
-      </w:r>
-      <w:r>
-        <w:t>uch higher variance (there are many, very rare words which need to be considered for a good distribution estimate).</w:t>
+        <w:t>The Layer Normalization also plays an important role in the Transformer architecture as it enables faster training and provides small regularization. Additionally, it ensures that the features are in a similar magnitude among the elements in the sequence. We are not using Batch Normalization because it depends on the batch size which is often small with Transformers (they require a lot of GPU memory), and BatchNorm has shown to perform particularly badly in language as the features of words tend to have a much higher variance (there are many, very rare words which need to be considered for a good distribution estimate).</w:t>
       </w:r>
     </w:p>
     <w:p>
@@ -13021,7 +13342,7 @@
                     </pic:cNvPicPr>
                   </pic:nvPicPr>
                   <pic:blipFill>
-                    <a:blip r:embed="rId26"/>
+                    <a:blip r:embed="rId32"/>
                     <a:stretch>
                       <a:fillRect/>
                     </a:stretch>
@@ -13498,7 +13819,7 @@
       <w:r>
         <w:t xml:space="preserve"> A crucial feature of PyTorch is the support of GPUs, short for Graphics Processing Unit. A GPU can perform many thousands of small operations in parallel, making it very well suitable for performing large matrix operations in neural networks. When comparing GPUs to CPUs, we can list the following </w:t>
       </w:r>
-      <w:hyperlink r:id="rId27">
+      <w:hyperlink r:id="rId33">
         <w:r>
           <w:rPr>
             <w:rStyle w:val="Hyperlink"/>
@@ -13517,7 +13838,7 @@
       <w:r>
         <w:t xml:space="preserve">CPUs and GPUs have both different advantages and disadvantages, which is why many computers contain both components and use them for different tasks. In case you are not familiar with GPUs, you can read up more details in this </w:t>
       </w:r>
-      <w:hyperlink r:id="rId28">
+      <w:hyperlink r:id="rId34">
         <w:r>
           <w:rPr>
             <w:rStyle w:val="Hyperlink"/>
@@ -13528,7 +13849,7 @@
       <w:r>
         <w:t xml:space="preserve"> or </w:t>
       </w:r>
-      <w:hyperlink r:id="rId29">
+      <w:hyperlink r:id="rId35">
         <w:r>
           <w:rPr>
             <w:rStyle w:val="Hyperlink"/>
@@ -13558,7 +13879,7 @@
       <w:r>
         <w:t xml:space="preserve"> which is essential for large neural networks. PyTorch implements a lot of functionality to support GPUs (mostly those of NVIDIA due to the libraries </w:t>
       </w:r>
-      <w:hyperlink r:id="rId30">
+      <w:hyperlink r:id="rId36">
         <w:r>
           <w:rPr>
             <w:rStyle w:val="Hyperlink"/>
@@ -13569,7 +13890,7 @@
       <w:r>
         <w:t xml:space="preserve"> and </w:t>
       </w:r>
-      <w:hyperlink r:id="rId31">
+      <w:hyperlink r:id="rId37">
         <w:r>
           <w:rPr>
             <w:rStyle w:val="Hyperlink"/>
@@ -13583,7 +13904,10 @@
     </w:p>
     <w:p>
       <w:pPr>
-        <w:pStyle w:val="BodyText"/>
+        <w:rPr>
+          <w:b/>
+          <w:bCs/>
+        </w:rPr>
       </w:pPr>
       <w:r>
         <w:t>To get a more direct comparison, let’s run our model for 50 training steps with both CPU and GPU.</w:t>
@@ -13601,12 +13925,14 @@
       <w:r>
         <w:t xml:space="preserve">: Run the </w:t>
       </w:r>
+      <w:proofErr w:type="spellStart"/>
       <w:r>
         <w:rPr>
           <w:rStyle w:val="VerbatimChar"/>
         </w:rPr>
         <w:t>cpu_gpu_comparison</w:t>
       </w:r>
+      <w:proofErr w:type="spellEnd"/>
       <w:r>
         <w:t xml:space="preserve"> in </w:t>
       </w:r>
@@ -13623,7 +13949,69 @@
         <w:br/>
       </w:r>
       <w:r>
-        <w:br/>
+        <w:rPr>
+          <w:b/>
+          <w:bCs/>
+        </w:rPr>
+        <w:t xml:space="preserve">running on device </w:t>
+      </w:r>
+      <w:proofErr w:type="spellStart"/>
+      <w:r>
+        <w:rPr>
+          <w:b/>
+          <w:bCs/>
+        </w:rPr>
+        <w:t>cpu</w:t>
+      </w:r>
+      <w:proofErr w:type="spellEnd"/>
+      <w:r>
+        <w:rPr>
+          <w:b/>
+          <w:bCs/>
+        </w:rPr>
+        <w:t xml:space="preserve">: </w:t>
+      </w:r>
+      <w:r>
+        <w:rPr>
+          <w:b/>
+          <w:bCs/>
+        </w:rPr>
+        <w:t>Trainer Time Elapsed: 269.88s</w:t>
+      </w:r>
+    </w:p>
+    <w:p>
+      <w:pPr>
+        <w:pStyle w:val="BodyText"/>
+      </w:pPr>
+      <w:r>
+        <w:rPr>
+          <w:b/>
+          <w:bCs/>
+        </w:rPr>
+        <w:t xml:space="preserve">running on device </w:t>
+      </w:r>
+      <w:proofErr w:type="spellStart"/>
+      <w:r>
+        <w:rPr>
+          <w:b/>
+          <w:bCs/>
+        </w:rPr>
+        <w:t>cuda</w:t>
+      </w:r>
+      <w:proofErr w:type="spellEnd"/>
+      <w:r>
+        <w:rPr>
+          <w:b/>
+          <w:bCs/>
+        </w:rPr>
+        <w:t xml:space="preserve">: </w:t>
+      </w:r>
+      <w:r>
+        <w:rPr>
+          <w:b/>
+          <w:bCs/>
+        </w:rPr>
+        <w:t>Trainer Time Elapsed: 5.73s</w:t>
       </w:r>
       <w:r>
         <w:br/>
@@ -13660,18 +14048,602 @@
       <w:r>
         <w:t xml:space="preserve"> to train the GPT language model, paste the two generated plots here. This function will also sample from the trained GPT LM. paste the completion to the prefix after the plots.</w:t>
       </w:r>
-      <w:r>
+    </w:p>
+    <w:p>
+      <w:pPr>
+        <w:pStyle w:val="BodyText"/>
+        <w:rPr>
+          <w:b/>
+          <w:bCs/>
+        </w:rPr>
+      </w:pPr>
+      <w:r>
+        <w:rPr>
+          <w:b/>
+          <w:bCs/>
+        </w:rPr>
+        <w:lastRenderedPageBreak/>
+        <w:drawing>
+          <wp:inline distT="0" distB="0" distL="0" distR="0" wp14:anchorId="1DA7FD09" wp14:editId="00A65099">
+            <wp:extent cx="4482299" cy="3249667"/>
+            <wp:effectExtent l="0" t="0" r="0" b="0"/>
+            <wp:docPr id="1645131172" name="Picture 1" descr="A graph of a graph&#10;&#10;AI-generated content may be incorrect."/>
+            <wp:cNvGraphicFramePr>
+              <a:graphicFrameLocks xmlns:a="http://schemas.openxmlformats.org/drawingml/2006/main" noChangeAspect="1"/>
+            </wp:cNvGraphicFramePr>
+            <a:graphic xmlns:a="http://schemas.openxmlformats.org/drawingml/2006/main">
+              <a:graphicData uri="http://schemas.openxmlformats.org/drawingml/2006/picture">
+                <pic:pic xmlns:pic="http://schemas.openxmlformats.org/drawingml/2006/picture">
+                  <pic:nvPicPr>
+                    <pic:cNvPr id="1645131172" name="Picture 1" descr="A graph of a graph&#10;&#10;AI-generated content may be incorrect."/>
+                    <pic:cNvPicPr/>
+                  </pic:nvPicPr>
+                  <pic:blipFill>
+                    <a:blip r:embed="rId38"/>
+                    <a:stretch>
+                      <a:fillRect/>
+                    </a:stretch>
+                  </pic:blipFill>
+                  <pic:spPr>
+                    <a:xfrm>
+                      <a:off x="0" y="0"/>
+                      <a:ext cx="4494800" cy="3258730"/>
+                    </a:xfrm>
+                    <a:prstGeom prst="rect">
+                      <a:avLst/>
+                    </a:prstGeom>
+                  </pic:spPr>
+                </pic:pic>
+              </a:graphicData>
+            </a:graphic>
+          </wp:inline>
+        </w:drawing>
+      </w:r>
+    </w:p>
+    <w:p>
+      <w:pPr>
+        <w:pStyle w:val="BodyText"/>
+        <w:rPr>
+          <w:b/>
+          <w:bCs/>
+        </w:rPr>
+      </w:pPr>
+      <w:r>
+        <w:rPr>
+          <w:b/>
+          <w:bCs/>
+        </w:rPr>
+        <w:drawing>
+          <wp:inline distT="0" distB="0" distL="0" distR="0" wp14:anchorId="1415EBEB" wp14:editId="1B8DF6B1">
+            <wp:extent cx="4076189" cy="3109836"/>
+            <wp:effectExtent l="0" t="0" r="0" b="0"/>
+            <wp:docPr id="1638638991" name="Picture 1" descr="A graph of a line graph&#10;&#10;AI-generated content may be incorrect."/>
+            <wp:cNvGraphicFramePr>
+              <a:graphicFrameLocks xmlns:a="http://schemas.openxmlformats.org/drawingml/2006/main" noChangeAspect="1"/>
+            </wp:cNvGraphicFramePr>
+            <a:graphic xmlns:a="http://schemas.openxmlformats.org/drawingml/2006/main">
+              <a:graphicData uri="http://schemas.openxmlformats.org/drawingml/2006/picture">
+                <pic:pic xmlns:pic="http://schemas.openxmlformats.org/drawingml/2006/picture">
+                  <pic:nvPicPr>
+                    <pic:cNvPr id="1638638991" name="Picture 1" descr="A graph of a line graph&#10;&#10;AI-generated content may be incorrect."/>
+                    <pic:cNvPicPr/>
+                  </pic:nvPicPr>
+                  <pic:blipFill>
+                    <a:blip r:embed="rId39"/>
+                    <a:stretch>
+                      <a:fillRect/>
+                    </a:stretch>
+                  </pic:blipFill>
+                  <pic:spPr>
+                    <a:xfrm>
+                      <a:off x="0" y="0"/>
+                      <a:ext cx="4137847" cy="3156877"/>
+                    </a:xfrm>
+                    <a:prstGeom prst="rect">
+                      <a:avLst/>
+                    </a:prstGeom>
+                  </pic:spPr>
+                </pic:pic>
+              </a:graphicData>
+            </a:graphic>
+          </wp:inline>
+        </w:drawing>
+      </w:r>
+    </w:p>
+    <w:p>
+      <w:pPr>
+        <w:pStyle w:val="BodyText"/>
+        <w:rPr>
+          <w:b/>
+          <w:bCs/>
+        </w:rPr>
+      </w:pPr>
+      <w:r>
+        <w:rPr>
+          <w:b/>
+          <w:bCs/>
+        </w:rPr>
         <w:br/>
       </w:r>
+      <w:r>
+        <w:rPr>
+          <w:b/>
+          <w:bCs/>
+        </w:rPr>
+        <w:t xml:space="preserve">The best perks of living on the east Wood </w:t>
+      </w:r>
+      <w:proofErr w:type="spellStart"/>
+      <w:r>
+        <w:rPr>
+          <w:b/>
+          <w:bCs/>
+        </w:rPr>
+        <w:t>underwateraminTeen</w:t>
+      </w:r>
+      <w:proofErr w:type="spellEnd"/>
+      <w:r>
+        <w:rPr>
+          <w:b/>
+          <w:bCs/>
+        </w:rPr>
+        <w:t xml:space="preserve"> Hardware shut ESL 403orrectunits</w:t>
+      </w:r>
+      <w:r>
+        <w:rPr>
+          <w:rFonts w:ascii="Microsoft JhengHei" w:eastAsia="Microsoft JhengHei" w:hAnsi="Microsoft JhengHei" w:cs="Microsoft JhengHei" w:hint="eastAsia"/>
+          <w:b/>
+          <w:bCs/>
+        </w:rPr>
+        <w:t>ファ</w:t>
+      </w:r>
+      <w:r>
+        <w:rPr>
+          <w:b/>
+          <w:bCs/>
+        </w:rPr>
+        <w:t xml:space="preserve">lashsetsPathDIS </w:t>
+      </w:r>
+      <w:proofErr w:type="spellStart"/>
+      <w:r>
+        <w:rPr>
+          <w:b/>
+          <w:bCs/>
+        </w:rPr>
+        <w:t>AdministrativeZASecret</w:t>
+      </w:r>
+      <w:proofErr w:type="spellEnd"/>
+      <w:r>
+        <w:rPr>
+          <w:b/>
+          <w:bCs/>
+        </w:rPr>
+        <w:t xml:space="preserve"> bag seizure right Craft </w:t>
+      </w:r>
+      <w:proofErr w:type="spellStart"/>
+      <w:r>
+        <w:rPr>
+          <w:b/>
+          <w:bCs/>
+        </w:rPr>
+        <w:t>phonysesangularerd</w:t>
+      </w:r>
+      <w:proofErr w:type="spellEnd"/>
+      <w:r>
+        <w:rPr>
+          <w:b/>
+          <w:bCs/>
+        </w:rPr>
+        <w:t xml:space="preserve"> </w:t>
+      </w:r>
+      <w:proofErr w:type="spellStart"/>
+      <w:r>
+        <w:rPr>
+          <w:b/>
+          <w:bCs/>
+        </w:rPr>
+        <w:t>metabolicostaippery</w:t>
+      </w:r>
+      <w:proofErr w:type="spellEnd"/>
+      <w:r>
+        <w:rPr>
+          <w:b/>
+          <w:bCs/>
+        </w:rPr>
+        <w:t xml:space="preserve"> Pandora</w:t>
+      </w:r>
+    </w:p>
+    <w:p>
+      <w:pPr>
+        <w:pStyle w:val="BodyText"/>
+        <w:rPr>
+          <w:b/>
+          <w:bCs/>
+        </w:rPr>
+      </w:pPr>
+      <w:r>
+        <w:rPr>
+          <w:b/>
+          <w:bCs/>
+        </w:rPr>
+        <w:t>--------------------------------------------------------------------------------</w:t>
+      </w:r>
+    </w:p>
+    <w:p>
+      <w:pPr>
+        <w:pStyle w:val="BodyText"/>
+        <w:rPr>
+          <w:b/>
+          <w:bCs/>
+        </w:rPr>
+      </w:pPr>
+      <w:r>
+        <w:rPr>
+          <w:b/>
+          <w:bCs/>
+        </w:rPr>
+        <w:lastRenderedPageBreak/>
+        <w:t xml:space="preserve"> It is a truth universally acknowledgedguidefaces32ReturnsTip </w:t>
+      </w:r>
+      <w:proofErr w:type="spellStart"/>
+      <w:r>
+        <w:rPr>
+          <w:b/>
+          <w:bCs/>
+        </w:rPr>
+        <w:t>OsakaprusSevensepar</w:t>
+      </w:r>
+      <w:proofErr w:type="spellEnd"/>
+      <w:r>
+        <w:rPr>
+          <w:b/>
+          <w:bCs/>
+        </w:rPr>
+        <w:t xml:space="preserve"> novice 373 TOUR bitten resh consulted prod Rapp paddle 900 longer </w:t>
+      </w:r>
+      <w:proofErr w:type="spellStart"/>
+      <w:r>
+        <w:rPr>
+          <w:b/>
+          <w:bCs/>
+        </w:rPr>
+        <w:t>catsProfessional</w:t>
+      </w:r>
+      <w:proofErr w:type="spellEnd"/>
+      <w:r>
+        <w:rPr>
+          <w:b/>
+          <w:bCs/>
+        </w:rPr>
+        <w:t xml:space="preserve"> </w:t>
+      </w:r>
+      <w:proofErr w:type="spellStart"/>
+      <w:r>
+        <w:rPr>
+          <w:b/>
+          <w:bCs/>
+        </w:rPr>
+        <w:t>touchesepingulhu</w:t>
+      </w:r>
+      <w:proofErr w:type="spellEnd"/>
+      <w:proofErr w:type="gramStart"/>
+      <w:r>
+        <w:rPr>
+          <w:b/>
+          <w:bCs/>
+        </w:rPr>
+        <w:t>")</w:t>
+      </w:r>
+      <w:proofErr w:type="spellStart"/>
+      <w:r>
+        <w:rPr>
+          <w:b/>
+          <w:bCs/>
+        </w:rPr>
+        <w:t>idden</w:t>
+      </w:r>
+      <w:proofErr w:type="spellEnd"/>
+      <w:proofErr w:type="gramEnd"/>
+      <w:r>
+        <w:rPr>
+          <w:b/>
+          <w:bCs/>
+        </w:rPr>
+        <w:t xml:space="preserve"> whales </w:t>
+      </w:r>
+      <w:proofErr w:type="spellStart"/>
+      <w:r>
+        <w:rPr>
+          <w:b/>
+          <w:bCs/>
+        </w:rPr>
+        <w:t>structureGirls</w:t>
+      </w:r>
+      <w:proofErr w:type="spellEnd"/>
+    </w:p>
+    <w:p>
+      <w:pPr>
+        <w:pStyle w:val="BodyText"/>
+        <w:rPr>
+          <w:b/>
+          <w:bCs/>
+        </w:rPr>
+      </w:pPr>
+      <w:r>
+        <w:rPr>
+          <w:b/>
+          <w:bCs/>
+        </w:rPr>
+        <w:t>--------------------------------------------------------------------------------</w:t>
+      </w:r>
+    </w:p>
+    <w:p>
+      <w:pPr>
+        <w:pStyle w:val="BodyText"/>
+        <w:rPr>
+          <w:b/>
+          <w:bCs/>
+        </w:rPr>
+      </w:pPr>
+      <w:r>
+        <w:rPr>
+          <w:b/>
+          <w:bCs/>
+        </w:rPr>
+        <w:t xml:space="preserve"> The best way to </w:t>
+      </w:r>
+      <w:proofErr w:type="spellStart"/>
+      <w:r>
+        <w:rPr>
+          <w:b/>
+          <w:bCs/>
+        </w:rPr>
+        <w:t>learnClass</w:t>
+      </w:r>
+      <w:proofErr w:type="spellEnd"/>
+      <w:r>
+        <w:rPr>
+          <w:b/>
+          <w:bCs/>
+        </w:rPr>
+        <w:t xml:space="preserve"> ENT ears cyber </w:t>
+      </w:r>
+      <w:proofErr w:type="spellStart"/>
+      <w:r>
+        <w:rPr>
+          <w:b/>
+          <w:bCs/>
+        </w:rPr>
+        <w:t>tookyahoo</w:t>
+      </w:r>
+      <w:proofErr w:type="spellEnd"/>
+      <w:r>
+        <w:rPr>
+          <w:b/>
+          <w:bCs/>
+        </w:rPr>
+        <w:t xml:space="preserve"> hatched340Sort </w:t>
+      </w:r>
+      <w:proofErr w:type="spellStart"/>
+      <w:r>
+        <w:rPr>
+          <w:b/>
+          <w:bCs/>
+        </w:rPr>
+        <w:t>Salvador</w:t>
+      </w:r>
+      <w:r>
+        <w:rPr>
+          <w:rFonts w:ascii="Microsoft JhengHei" w:eastAsia="Microsoft JhengHei" w:hAnsi="Microsoft JhengHei" w:cs="Microsoft JhengHei" w:hint="eastAsia"/>
+          <w:b/>
+          <w:bCs/>
+        </w:rPr>
+        <w:t>の</w:t>
+      </w:r>
+      <w:proofErr w:type="spellEnd"/>
+      <w:r>
+        <w:rPr>
+          <w:b/>
+          <w:bCs/>
+        </w:rPr>
+        <w:t xml:space="preserve">� Lac tact </w:t>
+      </w:r>
+      <w:proofErr w:type="spellStart"/>
+      <w:r>
+        <w:rPr>
+          <w:b/>
+          <w:bCs/>
+        </w:rPr>
+        <w:t>unamb</w:t>
+      </w:r>
+      <w:proofErr w:type="spellEnd"/>
+      <w:r>
+        <w:rPr>
+          <w:b/>
+          <w:bCs/>
+        </w:rPr>
+        <w:t xml:space="preserve"> imaginary </w:t>
+      </w:r>
+      <w:proofErr w:type="spellStart"/>
+      <w:r>
+        <w:rPr>
+          <w:b/>
+          <w:bCs/>
+        </w:rPr>
+        <w:t>DepotGGGG</w:t>
+      </w:r>
+      <w:proofErr w:type="spellEnd"/>
+      <w:r>
+        <w:rPr>
+          <w:b/>
+          <w:bCs/>
+        </w:rPr>
+        <w:t xml:space="preserve"> Generator </w:t>
+      </w:r>
+      <w:proofErr w:type="spellStart"/>
+      <w:r>
+        <w:rPr>
+          <w:b/>
+          <w:bCs/>
+        </w:rPr>
+        <w:t>CIeworks</w:t>
+      </w:r>
+      <w:proofErr w:type="spellEnd"/>
+      <w:r>
+        <w:rPr>
+          <w:b/>
+          <w:bCs/>
+        </w:rPr>
+        <w:t xml:space="preserve"> </w:t>
+      </w:r>
+      <w:proofErr w:type="spellStart"/>
+      <w:r>
+        <w:rPr>
+          <w:b/>
+          <w:bCs/>
+        </w:rPr>
+        <w:t>Metroobjectwichpolicy</w:t>
+      </w:r>
+      <w:proofErr w:type="spellEnd"/>
+      <w:r>
+        <w:rPr>
+          <w:b/>
+          <w:bCs/>
+        </w:rPr>
+        <w:t xml:space="preserve"> Ridge Patterson </w:t>
+      </w:r>
+      <w:proofErr w:type="spellStart"/>
+      <w:r>
+        <w:rPr>
+          <w:b/>
+          <w:bCs/>
+        </w:rPr>
+        <w:t>queEU</w:t>
+      </w:r>
+      <w:proofErr w:type="spellEnd"/>
+      <w:r>
+        <w:rPr>
+          <w:b/>
+          <w:bCs/>
+        </w:rPr>
+        <w:t xml:space="preserve"> turmoil132</w:t>
+      </w:r>
+    </w:p>
+    <w:p>
+      <w:pPr>
+        <w:pStyle w:val="BodyText"/>
+        <w:rPr>
+          <w:b/>
+          <w:bCs/>
+        </w:rPr>
+      </w:pPr>
+      <w:r>
+        <w:rPr>
+          <w:b/>
+          <w:bCs/>
+        </w:rPr>
+        <w:t>--------------------------------------------------------------------------------</w:t>
+      </w:r>
+    </w:p>
+    <w:p>
+      <w:pPr>
+        <w:pStyle w:val="BodyText"/>
+      </w:pPr>
+      <w:r>
+        <w:rPr>
+          <w:b/>
+          <w:bCs/>
+        </w:rPr>
+        <w:t xml:space="preserve"> According to the latest research NVIDIA subtle Anaheimeyed </w:t>
+      </w:r>
+      <w:proofErr w:type="spellStart"/>
+      <w:r>
+        <w:rPr>
+          <w:b/>
+          <w:bCs/>
+        </w:rPr>
+        <w:t>bargainmontFort</w:t>
+      </w:r>
+      <w:proofErr w:type="spellEnd"/>
+      <w:r>
+        <w:rPr>
+          <w:b/>
+          <w:bCs/>
+        </w:rPr>
+        <w:t xml:space="preserve"> playing awake designation Whites </w:t>
+      </w:r>
+      <w:proofErr w:type="spellStart"/>
+      <w:r>
+        <w:rPr>
+          <w:b/>
+          <w:bCs/>
+        </w:rPr>
+        <w:t>Juliusmableretconservancy</w:t>
+      </w:r>
+      <w:proofErr w:type="spellEnd"/>
+      <w:r>
+        <w:rPr>
+          <w:b/>
+          <w:bCs/>
+        </w:rPr>
+        <w:t xml:space="preserve"> Statement Profile crowds </w:t>
+      </w:r>
+      <w:proofErr w:type="gramStart"/>
+      <w:r>
+        <w:rPr>
+          <w:b/>
+          <w:bCs/>
+        </w:rPr>
+        <w:t>elites</w:t>
+      </w:r>
+      <w:proofErr w:type="gramEnd"/>
+      <w:r>
+        <w:rPr>
+          <w:b/>
+          <w:bCs/>
+        </w:rPr>
+        <w:t xml:space="preserve"> deception </w:t>
+      </w:r>
+      <w:proofErr w:type="spellStart"/>
+      <w:r>
+        <w:rPr>
+          <w:b/>
+          <w:bCs/>
+        </w:rPr>
+        <w:t>Newsp</w:t>
+      </w:r>
+      <w:proofErr w:type="spellEnd"/>
+      <w:r>
+        <w:rPr>
+          <w:b/>
+          <w:bCs/>
+        </w:rPr>
+        <w:t xml:space="preserve"> </w:t>
+      </w:r>
+      <w:proofErr w:type="spellStart"/>
+      <w:r>
+        <w:rPr>
+          <w:b/>
+          <w:bCs/>
+        </w:rPr>
+        <w:t>ast</w:t>
+      </w:r>
+      <w:proofErr w:type="spellEnd"/>
+      <w:r>
+        <w:rPr>
+          <w:b/>
+          <w:bCs/>
+        </w:rPr>
+        <w:t xml:space="preserve"> Cuomo dissolution 380 Strauss 184afa 214 Calvin</w:t>
+      </w:r>
     </w:p>
     <w:p>
       <w:pPr>
         <w:pStyle w:val="Heading1"/>
       </w:pPr>
       <w:bookmarkStart w:id="25" w:name="optional-feedback"/>
+      <w:bookmarkEnd w:id="11"/>
+      <w:bookmarkEnd w:id="14"/>
       <w:bookmarkEnd w:id="24"/>
-      <w:bookmarkEnd w:id="14"/>
-      <w:bookmarkEnd w:id="11"/>
       <w:r>
         <w:t>Optional Feedback</w:t>
       </w:r>
@@ -13683,8 +14655,8 @@
       <w:r>
         <w:t>Have feedback for this assignment? Found something confusing? We’d love to hear from you!</w:t>
       </w:r>
-    </w:p>
-    <w:bookmarkEnd w:id="25"/>
+      <w:bookmarkEnd w:id="25"/>
+    </w:p>
     <w:sectPr>
       <w:footnotePr>
         <w:numRestart w:val="eachSect"/>
@@ -15595,12 +16567,15 @@
 </file>
 
 <file path=customXml/item1.xml><?xml version="1.0" encoding="utf-8"?>
-<?mso-contentType ?>
-<FormTemplates xmlns="http://schemas.microsoft.com/sharepoint/v3/contenttype/forms">
-  <Display>DocumentLibraryForm</Display>
-  <Edit>DocumentLibraryForm</Edit>
-  <New>DocumentLibraryForm</New>
-</FormTemplates>
+<p:properties xmlns:p="http://schemas.microsoft.com/office/2006/metadata/properties" xmlns:xsi="http://www.w3.org/2001/XMLSchema-instance" xmlns:pc="http://schemas.microsoft.com/office/infopath/2007/PartnerControls">
+  <documentManagement>
+    <Tag xmlns="e3b5c32c-df6c-443f-b08b-73d85d62f2b5" xsi:nil="true"/>
+    <lcf76f155ced4ddcb4097134ff3c332f xmlns="e3b5c32c-df6c-443f-b08b-73d85d62f2b5">
+      <Terms xmlns="http://schemas.microsoft.com/office/infopath/2007/PartnerControls"/>
+    </lcf76f155ced4ddcb4097134ff3c332f>
+    <TaxCatchAll xmlns="168931df-3f45-4445-be76-105235143e52" xsi:nil="true"/>
+  </documentManagement>
+</p:properties>
 </file>
 
 <file path=customXml/item2.xml><?xml version="1.0" encoding="utf-8"?>
@@ -15867,21 +16842,21 @@
 </file>
 
 <file path=customXml/item3.xml><?xml version="1.0" encoding="utf-8"?>
-<p:properties xmlns:p="http://schemas.microsoft.com/office/2006/metadata/properties" xmlns:xsi="http://www.w3.org/2001/XMLSchema-instance" xmlns:pc="http://schemas.microsoft.com/office/infopath/2007/PartnerControls">
-  <documentManagement>
-    <Tag xmlns="e3b5c32c-df6c-443f-b08b-73d85d62f2b5" xsi:nil="true"/>
-    <lcf76f155ced4ddcb4097134ff3c332f xmlns="e3b5c32c-df6c-443f-b08b-73d85d62f2b5">
-      <Terms xmlns="http://schemas.microsoft.com/office/infopath/2007/PartnerControls"/>
-    </lcf76f155ced4ddcb4097134ff3c332f>
-    <TaxCatchAll xmlns="168931df-3f45-4445-be76-105235143e52" xsi:nil="true"/>
-  </documentManagement>
-</p:properties>
+<?mso-contentType ?>
+<FormTemplates xmlns="http://schemas.microsoft.com/sharepoint/v3/contenttype/forms">
+  <Display>DocumentLibraryForm</Display>
+  <Edit>DocumentLibraryForm</Edit>
+  <New>DocumentLibraryForm</New>
+</FormTemplates>
 </file>
 
 <file path=customXml/itemProps1.xml><?xml version="1.0" encoding="utf-8"?>
-<ds:datastoreItem xmlns:ds="http://schemas.openxmlformats.org/officeDocument/2006/customXml" ds:itemID="{6DC721D0-8C37-4ED0-B2BA-E5D496784399}">
+<ds:datastoreItem xmlns:ds="http://schemas.openxmlformats.org/officeDocument/2006/customXml" ds:itemID="{57FE726F-209B-4B07-A667-913F25694FF4}">
   <ds:schemaRefs>
-    <ds:schemaRef ds:uri="http://schemas.microsoft.com/sharepoint/v3/contenttype/forms"/>
+    <ds:schemaRef ds:uri="http://schemas.microsoft.com/office/2006/metadata/properties"/>
+    <ds:schemaRef ds:uri="http://schemas.microsoft.com/office/infopath/2007/PartnerControls"/>
+    <ds:schemaRef ds:uri="e3b5c32c-df6c-443f-b08b-73d85d62f2b5"/>
+    <ds:schemaRef ds:uri="168931df-3f45-4445-be76-105235143e52"/>
   </ds:schemaRefs>
 </ds:datastoreItem>
 </file>
@@ -15906,12 +16881,9 @@
 </file>
 
 <file path=customXml/itemProps3.xml><?xml version="1.0" encoding="utf-8"?>
-<ds:datastoreItem xmlns:ds="http://schemas.openxmlformats.org/officeDocument/2006/customXml" ds:itemID="{57FE726F-209B-4B07-A667-913F25694FF4}">
+<ds:datastoreItem xmlns:ds="http://schemas.openxmlformats.org/officeDocument/2006/customXml" ds:itemID="{6DC721D0-8C37-4ED0-B2BA-E5D496784399}">
   <ds:schemaRefs>
-    <ds:schemaRef ds:uri="http://schemas.microsoft.com/office/2006/metadata/properties"/>
-    <ds:schemaRef ds:uri="http://schemas.microsoft.com/office/infopath/2007/PartnerControls"/>
-    <ds:schemaRef ds:uri="e3b5c32c-df6c-443f-b08b-73d85d62f2b5"/>
-    <ds:schemaRef ds:uri="168931df-3f45-4445-be76-105235143e52"/>
+    <ds:schemaRef ds:uri="http://schemas.microsoft.com/sharepoint/v3/contenttype/forms"/>
   </ds:schemaRefs>
 </ds:datastoreItem>
 </file>
</xml_diff>